<commit_message>
docs(reports): the opposition lift ends at 60.2% in both reports, and name the output governed data
The dossier stopped the retrieval-redesign story at the relational store
(44%) while the technical report carried the funnel through the semantic
residue resolver to 60.2%. A reader holding both saw a disagreement. The
dossier now states the full chain; 44% stays as the intermediate stage,
which is what it actually measures.

Both reports also described governed output without ever naming it --
harnesses, deterministic code, gates the model cannot reach. "Governed
data" is added as the term: defined in the dossier's section 5 and the
technical report's abstract, reused once in each.

Co-Authored-By: Claude Opus 5 (1M context) <noreply@anthropic.com>
</commit_message>
<xml_diff>
--- a/data/reports/axial-report.docx
+++ b/data/reports/axial-report.docx
@@ -85,7 +85,16 @@
     </w:p>
     <w:p>
       <w:r>
-        <w:t>That makes it different in kind from the tools most readers already have. A chat assistant with PDFs attached, like every "chat with your documents" product, searches first and reads second: it sees only the fragments a question happens to retrieve, and nothing in its output separates what a source asserted from what the model composed on top. Axial reads everything before any question is asked. Every assertion in its output is marked as exactly one of three kinds — a source says it, Axial inferred it across sources, or the analyst's judgment — and the marking is enforced by checks that block release, not requested in a prompt. The model that drafts the final paper has no access to the library at all: its whole world is the list of claims that already passed the checks, so citing invented evidence is not forbidden by instruction but impossible by construction.</w:t>
+        <w:t xml:space="preserve">That makes it different in kind from the tools most readers already have. A chat assistant with PDFs attached, like every "chat with your documents" product, searches first and reads second: it sees only the fragments a question happens to retrieve, and nothing in its output separates what a source asserted from what the model composed on top. Axial reads everything before any question is asked. Every assertion in its output is marked as exactly one of three kinds — a source says it, Axial inferred it across sources, or the analyst's judgment — and the marking is enforced by checks that block release, not requested in a prompt. The model that drafts the final paper has no access to the library at all: its whole world is the list of claims that already passed the checks, so citing invented evidence is not forbidden by instruction but impossible by construction. What comes out is </w:t>
+      </w:r>
+      <w:r>
+        <w:rPr>
+          <w:b/>
+        </w:rPr>
+        <w:t>governed data</w:t>
+      </w:r>
+      <w:r>
+        <w:t xml:space="preserve"> rather than model prose: every record carries its source, its kind and its confidence because code put them there.</w:t>
       </w:r>
     </w:p>
     <w:p>
@@ -3448,7 +3457,16 @@
         <w:t>43,101 cross-source opposition pairs</w:t>
       </w:r>
       <w:r>
-        <w:t>. That is the redesign that made this version of the report necessary.</w:t>
+        <w:t xml:space="preserve">. Resolving what was left against the argument map — the targets that describe a position in prose, with no name in them to join on — took it to </w:t>
+      </w:r>
+      <w:r>
+        <w:rPr>
+          <w:b/>
+        </w:rPr>
+        <w:t>60.2%</w:t>
+      </w:r>
+      <w:r>
+        <w:t xml:space="preserve"> of all targets, for $1.08. That is the redesign that made this version of the report necessary.</w:t>
       </w:r>
     </w:p>
     <w:p>
@@ -3538,6 +3556,20 @@
           <w:i/>
         </w:rPr>
         <w:t>accountability to grounds, with honest confidence.</w:t>
+      </w:r>
+    </w:p>
+    <w:p>
+      <w:r>
+        <w:t xml:space="preserve">What that produces is </w:t>
+      </w:r>
+      <w:r>
+        <w:rPr>
+          <w:b/>
+        </w:rPr>
+        <w:t>governed data</w:t>
+      </w:r>
+      <w:r>
+        <w:t>, not model output. Every record carries where it came from, what kind of statement it is, and how much confidence it is entitled to, and code put all three there. None of them was requested in a prompt, and no model can omit them. A model writes the content; what counts as a record is not its decision.</w:t>
       </w:r>
     </w:p>
     <w:p>

</xml_diff>

<commit_message>
docs(reports): the opposition lift ends at 60.2% in both reports, and name the output governed data (#721)
The dossier stopped the retrieval-redesign story at the relational store
(44%) while the technical report carried the funnel through the semantic
residue resolver to 60.2%. A reader holding both saw a disagreement. The
dossier now states the full chain; 44% stays as the intermediate stage,
which is what it actually measures.

Both reports also described governed output without ever naming it --
harnesses, deterministic code, gates the model cannot reach. "Governed
data" is added as the term: defined in the dossier's section 5 and the
technical report's abstract, reused once in each.

Co-authored-by: Claude Opus 5 (1M context) <noreply@anthropic.com>
</commit_message>
<xml_diff>
--- a/data/reports/axial-report.docx
+++ b/data/reports/axial-report.docx
@@ -85,7 +85,16 @@
     </w:p>
     <w:p>
       <w:r>
-        <w:t>That makes it different in kind from the tools most readers already have. A chat assistant with PDFs attached, like every "chat with your documents" product, searches first and reads second: it sees only the fragments a question happens to retrieve, and nothing in its output separates what a source asserted from what the model composed on top. Axial reads everything before any question is asked. Every assertion in its output is marked as exactly one of three kinds — a source says it, Axial inferred it across sources, or the analyst's judgment — and the marking is enforced by checks that block release, not requested in a prompt. The model that drafts the final paper has no access to the library at all: its whole world is the list of claims that already passed the checks, so citing invented evidence is not forbidden by instruction but impossible by construction.</w:t>
+        <w:t xml:space="preserve">That makes it different in kind from the tools most readers already have. A chat assistant with PDFs attached, like every "chat with your documents" product, searches first and reads second: it sees only the fragments a question happens to retrieve, and nothing in its output separates what a source asserted from what the model composed on top. Axial reads everything before any question is asked. Every assertion in its output is marked as exactly one of three kinds — a source says it, Axial inferred it across sources, or the analyst's judgment — and the marking is enforced by checks that block release, not requested in a prompt. The model that drafts the final paper has no access to the library at all: its whole world is the list of claims that already passed the checks, so citing invented evidence is not forbidden by instruction but impossible by construction. What comes out is </w:t>
+      </w:r>
+      <w:r>
+        <w:rPr>
+          <w:b/>
+        </w:rPr>
+        <w:t>governed data</w:t>
+      </w:r>
+      <w:r>
+        <w:t xml:space="preserve"> rather than model prose: every record carries its source, its kind and its confidence because code put them there.</w:t>
       </w:r>
     </w:p>
     <w:p>
@@ -3448,7 +3457,16 @@
         <w:t>43,101 cross-source opposition pairs</w:t>
       </w:r>
       <w:r>
-        <w:t>. That is the redesign that made this version of the report necessary.</w:t>
+        <w:t xml:space="preserve">. Resolving what was left against the argument map — the targets that describe a position in prose, with no name in them to join on — took it to </w:t>
+      </w:r>
+      <w:r>
+        <w:rPr>
+          <w:b/>
+        </w:rPr>
+        <w:t>60.2%</w:t>
+      </w:r>
+      <w:r>
+        <w:t xml:space="preserve"> of all targets, for $1.08. That is the redesign that made this version of the report necessary.</w:t>
       </w:r>
     </w:p>
     <w:p>
@@ -3538,6 +3556,20 @@
           <w:i/>
         </w:rPr>
         <w:t>accountability to grounds, with honest confidence.</w:t>
+      </w:r>
+    </w:p>
+    <w:p>
+      <w:r>
+        <w:t xml:space="preserve">What that produces is </w:t>
+      </w:r>
+      <w:r>
+        <w:rPr>
+          <w:b/>
+        </w:rPr>
+        <w:t>governed data</w:t>
+      </w:r>
+      <w:r>
+        <w:t>, not model output. Every record carries where it came from, what kind of statement it is, and how much confidence it is entitled to, and code put all three there. None of them was requested in a prompt, and no model can omit them. A model writes the content; what counts as a record is not its decision.</w:t>
       </w:r>
     </w:p>
     <w:p>

</xml_diff>

<commit_message>
docs(reports): rebuild both .docx from the corrected markdown
The markdown was corrected in c560c74; the Word artifacts beside it still
carried the retired reproducibility figures. Rebuilt with the repo's own
scripts -- md_to_docx.py for the research report, build_docx_with_diagrams.py
for the technical one, which the plain converter would strip of its ten
mermaid figures.

Co-Authored-By: Claude Opus 5 (1M context) <noreply@anthropic.com>
</commit_message>
<xml_diff>
--- a/data/reports/axial-report.docx
+++ b/data/reports/axial-report.docx
@@ -59,7 +59,7 @@
     </w:p>
     <w:p>
       <w:r>
-        <w:t>Version 2.2 · 7 August 2026 · Muhanad Abulhusn</w:t>
+        <w:t>Version 2.3 · 7 August 2026 · Muhanad Abulhusn</w:t>
       </w:r>
     </w:p>
     <w:p>
@@ -67,7 +67,7 @@
         <w:rPr>
           <w:i/>
         </w:rPr>
-        <w:t>Version 2.2 adds Appendix F, an index of the six further papers drafted since — five of them deliberately off the Syrian case the library is built around — and records what that exercise exposed about the shelf. Nothing in the system or its evaluation has changed; the panel figures in section 7.4 still cover the two papers in Appendices D and E and nothing else. Version 2.1 (6 August 2026) restructured the dossier as a research paper: an executive summary at the front, the full question inventory moved to an appendix, and the closing section recast as a final word. Version 1.0 (1 August 2026) remains superseded: it described a retrieval layer and a final deliverable that have both since been replaced.</w:t>
+        <w:t>Version 2.3 corrects §7.6's two reproducibility figures against the run logs behind them: Gather's byte-identical self-disagreement is 19.3% per name, not the 53% flip rate that belongs to a changed packet, and name merging moves 0.43% of the material. Version 2.2 adds Appendix F, an index of the six further papers drafted since — five of them deliberately off the Syrian case the library is built around — and records what that exercise exposed about the shelf. Nothing in the system or its evaluation has changed; the panel figures in section 7.4 still cover the two papers in Appendices D and E and nothing else. Version 2.1 (6 August 2026) restructured the dossier as a research paper: an executive summary at the front, the full question inventory moved to an appendix, and the closing section recast as a final word. Version 1.0 (1 August 2026) remains superseded: it described a retrieval layer and a final deliverable that have both since been replaced.</w:t>
       </w:r>
     </w:p>
     <w:p>
@@ -8012,7 +8012,16 @@
         <w:t>Gather does not fully reproduce.</w:t>
       </w:r>
       <w:r>
-        <w:t xml:space="preserve"> Asked twice about the same name, on byte-identical input, the pass agrees with itself 53% of the time, and </w:t>
+        <w:t xml:space="preserve"> Asked twice about the same name, on byte-identical input, the pass returns a different answer </w:t>
+      </w:r>
+      <w:r>
+        <w:rPr>
+          <w:b/>
+        </w:rPr>
+        <w:t>19.3% of the time</w:t>
+      </w:r>
+      <w:r>
+        <w:t xml:space="preserve">, and — the figure that matters more — </w:t>
       </w:r>
       <w:r>
         <w:rPr>
@@ -8021,7 +8030,7 @@
         <w:t>36.1% of the disagreements it records come back null on the second reading</w:t>
       </w:r>
       <w:r>
-        <w:t xml:space="preserve">. This was investigated and accepted as model variance. Its consequence is enforced in the design rather than hoped away: </w:t>
+        <w:t xml:space="preserve">. That second number is the honest confidence interval on a name page's central claim: it is the share of asserted disagreements the pass would not re-assert ten hours later. This was investigated and accepted as model variance. Its consequence is enforced in the design rather than hoped away: </w:t>
       </w:r>
       <w:r>
         <w:rPr>
@@ -8047,7 +8056,7 @@
         <w:rPr>
           <w:b/>
         </w:rPr>
-        <w:t>0.4% of the underlying material</w:t>
+        <w:t>0.43% of the underlying material</w:t>
       </w:r>
       <w:r>
         <w:t>. A surface changing group is not its evidence moving, and conflating the two overstated the problem by a factor of thirty.</w:t>

</xml_diff>

<commit_message>
docs(reports): rebuild both .docx from the corrected markdown (#778)
The markdown was corrected in c560c74; the Word artifacts beside it still
carried the retired reproducibility figures. Rebuilt with the repo's own
scripts -- md_to_docx.py for the research report, build_docx_with_diagrams.py
for the technical one, which the plain converter would strip of its ten
mermaid figures.

Co-authored-by: Claude Opus 5 (1M context) <noreply@anthropic.com>
</commit_message>
<xml_diff>
--- a/data/reports/axial-report.docx
+++ b/data/reports/axial-report.docx
@@ -59,7 +59,7 @@
     </w:p>
     <w:p>
       <w:r>
-        <w:t>Version 2.2 · 7 August 2026 · Muhanad Abulhusn</w:t>
+        <w:t>Version 2.3 · 7 August 2026 · Muhanad Abulhusn</w:t>
       </w:r>
     </w:p>
     <w:p>
@@ -67,7 +67,7 @@
         <w:rPr>
           <w:i/>
         </w:rPr>
-        <w:t>Version 2.2 adds Appendix F, an index of the six further papers drafted since — five of them deliberately off the Syrian case the library is built around — and records what that exercise exposed about the shelf. Nothing in the system or its evaluation has changed; the panel figures in section 7.4 still cover the two papers in Appendices D and E and nothing else. Version 2.1 (6 August 2026) restructured the dossier as a research paper: an executive summary at the front, the full question inventory moved to an appendix, and the closing section recast as a final word. Version 1.0 (1 August 2026) remains superseded: it described a retrieval layer and a final deliverable that have both since been replaced.</w:t>
+        <w:t>Version 2.3 corrects §7.6's two reproducibility figures against the run logs behind them: Gather's byte-identical self-disagreement is 19.3% per name, not the 53% flip rate that belongs to a changed packet, and name merging moves 0.43% of the material. Version 2.2 adds Appendix F, an index of the six further papers drafted since — five of them deliberately off the Syrian case the library is built around — and records what that exercise exposed about the shelf. Nothing in the system or its evaluation has changed; the panel figures in section 7.4 still cover the two papers in Appendices D and E and nothing else. Version 2.1 (6 August 2026) restructured the dossier as a research paper: an executive summary at the front, the full question inventory moved to an appendix, and the closing section recast as a final word. Version 1.0 (1 August 2026) remains superseded: it described a retrieval layer and a final deliverable that have both since been replaced.</w:t>
       </w:r>
     </w:p>
     <w:p>
@@ -8012,7 +8012,16 @@
         <w:t>Gather does not fully reproduce.</w:t>
       </w:r>
       <w:r>
-        <w:t xml:space="preserve"> Asked twice about the same name, on byte-identical input, the pass agrees with itself 53% of the time, and </w:t>
+        <w:t xml:space="preserve"> Asked twice about the same name, on byte-identical input, the pass returns a different answer </w:t>
+      </w:r>
+      <w:r>
+        <w:rPr>
+          <w:b/>
+        </w:rPr>
+        <w:t>19.3% of the time</w:t>
+      </w:r>
+      <w:r>
+        <w:t xml:space="preserve">, and — the figure that matters more — </w:t>
       </w:r>
       <w:r>
         <w:rPr>
@@ -8021,7 +8030,7 @@
         <w:t>36.1% of the disagreements it records come back null on the second reading</w:t>
       </w:r>
       <w:r>
-        <w:t xml:space="preserve">. This was investigated and accepted as model variance. Its consequence is enforced in the design rather than hoped away: </w:t>
+        <w:t xml:space="preserve">. That second number is the honest confidence interval on a name page's central claim: it is the share of asserted disagreements the pass would not re-assert ten hours later. This was investigated and accepted as model variance. Its consequence is enforced in the design rather than hoped away: </w:t>
       </w:r>
       <w:r>
         <w:rPr>
@@ -8047,7 +8056,7 @@
         <w:rPr>
           <w:b/>
         </w:rPr>
-        <w:t>0.4% of the underlying material</w:t>
+        <w:t>0.43% of the underlying material</w:t>
       </w:r>
       <w:r>
         <w:t>. A surface changing group is not its evidence moving, and conflating the two overstated the problem by a factor of thirty.</w:t>

</xml_diff>